<commit_message>
Added User Registration and Login functional Requirements
</commit_message>
<xml_diff>
--- a/docs/SRS.docx
+++ b/docs/SRS.docx
@@ -25,19 +25,11 @@
           <w:lang w:val="en-US"/>
         </w:rPr>
       </w:pPr>
-      <w:proofErr w:type="spellStart"/>
-      <w:r>
-        <w:rPr>
-          <w:lang w:val="en-US"/>
-        </w:rPr>
-        <w:t>TaxiTap</w:t>
-      </w:r>
-      <w:proofErr w:type="spellEnd"/>
-      <w:r>
-        <w:rPr>
-          <w:lang w:val="en-US"/>
-        </w:rPr>
-        <w:t xml:space="preserve"> by Git It Done</w:t>
+      <w:r>
+        <w:rPr>
+          <w:lang w:val="en-US"/>
+        </w:rPr>
+        <w:t>TaxiTap by Git It Done</w:t>
       </w:r>
     </w:p>
     <w:p>
@@ -63,79 +55,14 @@
           <w:lang w:val="en-US"/>
         </w:rPr>
       </w:pPr>
-      <w:proofErr w:type="spellStart"/>
-      <w:r>
-        <w:rPr>
-          <w:rFonts w:ascii="Arial" w:hAnsi="Arial" w:cs="Arial"/>
-          <w:sz w:val="28"/>
-          <w:szCs w:val="28"/>
-          <w:lang w:val="en-US"/>
-        </w:rPr>
-        <w:t>TaxiTap</w:t>
-      </w:r>
-      <w:proofErr w:type="spellEnd"/>
-      <w:r>
-        <w:rPr>
-          <w:rFonts w:ascii="Arial" w:hAnsi="Arial" w:cs="Arial"/>
-          <w:sz w:val="28"/>
-          <w:szCs w:val="28"/>
-          <w:lang w:val="en-US"/>
-        </w:rPr>
-        <w:t xml:space="preserve"> is a mobile platform designed to </w:t>
-      </w:r>
-      <w:r>
-        <w:rPr>
-          <w:rFonts w:ascii="Arial" w:hAnsi="Arial" w:cs="Arial"/>
-          <w:sz w:val="28"/>
-          <w:szCs w:val="28"/>
-          <w:lang w:val="en-US"/>
-        </w:rPr>
-        <w:t>revolutionize</w:t>
-      </w:r>
-      <w:r>
-        <w:rPr>
-          <w:rFonts w:ascii="Arial" w:hAnsi="Arial" w:cs="Arial"/>
-          <w:sz w:val="28"/>
-          <w:szCs w:val="28"/>
-          <w:lang w:val="en-US"/>
-        </w:rPr>
-        <w:t xml:space="preserve"> South Africa’s minibus taxi industry by </w:t>
-      </w:r>
-      <w:r>
-        <w:rPr>
-          <w:rFonts w:ascii="Arial" w:hAnsi="Arial" w:cs="Arial"/>
-          <w:sz w:val="28"/>
-          <w:szCs w:val="28"/>
-          <w:lang w:val="en-US"/>
-        </w:rPr>
-        <w:t>digitizing</w:t>
-      </w:r>
-      <w:r>
-        <w:rPr>
-          <w:rFonts w:ascii="Arial" w:hAnsi="Arial" w:cs="Arial"/>
-          <w:sz w:val="28"/>
-          <w:szCs w:val="28"/>
-          <w:lang w:val="en-US"/>
-        </w:rPr>
-        <w:t xml:space="preserve"> route information, eliminating the need for constant hooting, and creating a semi-structured booking system while preserving the flexibility that makes taxis an essential </w:t>
-      </w:r>
-      <w:r>
-        <w:rPr>
-          <w:rFonts w:ascii="Arial" w:hAnsi="Arial" w:cs="Arial"/>
-          <w:sz w:val="28"/>
-          <w:szCs w:val="28"/>
-          <w:lang w:val="en-US"/>
-        </w:rPr>
-        <w:t>mode of transport</w:t>
-      </w:r>
-      <w:r>
-        <w:rPr>
-          <w:rFonts w:ascii="Arial" w:hAnsi="Arial" w:cs="Arial"/>
-          <w:sz w:val="28"/>
-          <w:szCs w:val="28"/>
-          <w:lang w:val="en-US"/>
-        </w:rPr>
-        <w:t>. The system connects passengers and taxi operators through a location-aware mobile application that facilitates taxi requests, communicates passenger locations, manages payments, and provides real-time vehicle tracking – all without fundamentally changing the existing system's multi-passenger, flexible route nature.</w:t>
+      <w:r>
+        <w:rPr>
+          <w:rFonts w:ascii="Arial" w:hAnsi="Arial" w:cs="Arial"/>
+          <w:sz w:val="28"/>
+          <w:szCs w:val="28"/>
+          <w:lang w:val="en-US"/>
+        </w:rPr>
+        <w:t>TaxiTap is a mobile platform designed to revolutionize South Africa’s minibus taxi industry by digitizing route information, eliminating the need for constant hooting, and creating a semi-structured booking system while preserving the flexibility that makes taxis an essential mode of transport. The system connects passengers and taxi operators through a location-aware mobile application that facilitates taxi requests, communicates passenger locations, manages payments, and provides real-time vehicle tracking – all without fundamentally changing the existing system's multi-passenger, flexible route nature.</w:t>
       </w:r>
     </w:p>
     <w:p>
@@ -290,19 +217,7 @@
         <w:rPr>
           <w:lang w:val="en-US"/>
         </w:rPr>
-        <w:t xml:space="preserve">Service </w:t>
-      </w:r>
-      <w:r>
-        <w:rPr>
-          <w:lang w:val="en-US"/>
-        </w:rPr>
-        <w:t>C</w:t>
-      </w:r>
-      <w:r>
-        <w:rPr>
-          <w:lang w:val="en-US"/>
-        </w:rPr>
-        <w:t>ontracts</w:t>
+        <w:t>Service Contracts</w:t>
       </w:r>
     </w:p>
     <w:p>
@@ -316,19 +231,7 @@
         <w:rPr>
           <w:lang w:val="en-US"/>
         </w:rPr>
-        <w:t xml:space="preserve">Class </w:t>
-      </w:r>
-      <w:r>
-        <w:rPr>
-          <w:lang w:val="en-US"/>
-        </w:rPr>
-        <w:t>Dia</w:t>
-      </w:r>
-      <w:r>
-        <w:rPr>
-          <w:lang w:val="en-US"/>
-        </w:rPr>
-        <w:t>gram</w:t>
+        <w:t>Class Diagram</w:t>
       </w:r>
     </w:p>
     <w:p>
@@ -347,22 +250,103 @@
     </w:p>
     <w:p>
       <w:pPr>
-        <w:rPr>
-          <w:rFonts w:ascii="Arial" w:hAnsi="Arial" w:cs="Arial"/>
-          <w:sz w:val="28"/>
-          <w:szCs w:val="28"/>
-          <w:lang w:val="en-US"/>
-        </w:rPr>
-      </w:pPr>
-      <w:r>
-        <w:rPr>
-          <w:rFonts w:ascii="Arial" w:hAnsi="Arial" w:cs="Arial"/>
-          <w:sz w:val="28"/>
-          <w:szCs w:val="28"/>
-          <w:lang w:val="en-US"/>
-        </w:rPr>
-        <w:t>List all functional requirements and the sub requirements.</w:t>
-      </w:r>
+        <w:numPr>
+          <w:ilvl w:val="0"/>
+          <w:numId w:val="3"/>
+        </w:numPr>
+        <w:rPr>
+          <w:rFonts w:ascii="Arial" w:hAnsi="Arial" w:cs="Arial"/>
+          <w:sz w:val="28"/>
+          <w:szCs w:val="28"/>
+        </w:rPr>
+      </w:pPr>
+      <w:r>
+        <w:rPr>
+          <w:rFonts w:ascii="Arial" w:hAnsi="Arial" w:cs="Arial"/>
+          <w:sz w:val="28"/>
+          <w:szCs w:val="28"/>
+        </w:rPr>
+        <w:t>User Registration and Login</w:t>
+      </w:r>
+    </w:p>
+    <w:p>
+      <w:pPr>
+        <w:rPr>
+          <w:rFonts w:ascii="Arial" w:hAnsi="Arial" w:cs="Arial"/>
+          <w:sz w:val="28"/>
+          <w:szCs w:val="28"/>
+        </w:rPr>
+      </w:pPr>
+      <w:r>
+        <w:rPr>
+          <w:rFonts w:ascii="Arial" w:hAnsi="Arial" w:cs="Arial"/>
+          <w:sz w:val="28"/>
+          <w:szCs w:val="28"/>
+        </w:rPr>
+        <w:t>1.1 Users should be able to register on the app as either a taxi driver or a passenger.</w:t>
+      </w:r>
+    </w:p>
+    <w:p>
+      <w:pPr>
+        <w:rPr>
+          <w:rFonts w:ascii="Arial" w:hAnsi="Arial" w:cs="Arial"/>
+          <w:sz w:val="28"/>
+          <w:szCs w:val="28"/>
+        </w:rPr>
+      </w:pPr>
+      <w:r>
+        <w:rPr>
+          <w:rFonts w:ascii="Arial" w:hAnsi="Arial" w:cs="Arial"/>
+          <w:sz w:val="28"/>
+          <w:szCs w:val="28"/>
+        </w:rPr>
+        <w:lastRenderedPageBreak/>
+        <w:t>1.2 Users registered as a taxi driver should be able to register a vehicle, with its relevant details.</w:t>
+      </w:r>
+    </w:p>
+    <w:p>
+      <w:pPr>
+        <w:rPr>
+          <w:rFonts w:ascii="Arial" w:hAnsi="Arial" w:cs="Arial"/>
+          <w:sz w:val="28"/>
+          <w:szCs w:val="28"/>
+        </w:rPr>
+      </w:pPr>
+      <w:r>
+        <w:rPr>
+          <w:rFonts w:ascii="Arial" w:hAnsi="Arial" w:cs="Arial"/>
+          <w:sz w:val="28"/>
+          <w:szCs w:val="28"/>
+        </w:rPr>
+        <w:t>1.3 Users should be able to Login in to the system using a unique username and a password.</w:t>
+      </w:r>
+    </w:p>
+    <w:p>
+      <w:pPr>
+        <w:rPr>
+          <w:rFonts w:ascii="Arial" w:hAnsi="Arial" w:cs="Arial"/>
+          <w:sz w:val="28"/>
+          <w:szCs w:val="28"/>
+        </w:rPr>
+      </w:pPr>
+      <w:r>
+        <w:rPr>
+          <w:rFonts w:ascii="Arial" w:hAnsi="Arial" w:cs="Arial"/>
+          <w:sz w:val="28"/>
+          <w:szCs w:val="28"/>
+        </w:rPr>
+        <w:t>1.4 Users intending to register as passengers should be able to register their name, phone number and payment preferences</w:t>
+      </w:r>
+    </w:p>
+    <w:p>
+      <w:pPr>
+        <w:rPr>
+          <w:rFonts w:ascii="Arial" w:hAnsi="Arial" w:cs="Arial"/>
+          <w:sz w:val="28"/>
+          <w:szCs w:val="28"/>
+          <w:lang w:val="en-US"/>
+        </w:rPr>
+      </w:pPr>
     </w:p>
     <w:p>
       <w:pPr>
@@ -394,27 +378,7 @@
           <w:szCs w:val="28"/>
           <w:lang w:val="en-US"/>
         </w:rPr>
-        <w:t xml:space="preserve">Use case diagrams of different parts of </w:t>
-      </w:r>
-      <w:proofErr w:type="gramStart"/>
-      <w:r>
-        <w:rPr>
-          <w:rFonts w:ascii="Arial" w:hAnsi="Arial" w:cs="Arial"/>
-          <w:sz w:val="28"/>
-          <w:szCs w:val="28"/>
-          <w:lang w:val="en-US"/>
-        </w:rPr>
-        <w:t>system</w:t>
-      </w:r>
-      <w:proofErr w:type="gramEnd"/>
-      <w:r>
-        <w:rPr>
-          <w:rFonts w:ascii="Arial" w:hAnsi="Arial" w:cs="Arial"/>
-          <w:sz w:val="28"/>
-          <w:szCs w:val="28"/>
-          <w:lang w:val="en-US"/>
-        </w:rPr>
-        <w:t>.</w:t>
+        <w:t>Use case diagrams of different parts of system.</w:t>
       </w:r>
     </w:p>
     <w:p>
@@ -610,6 +574,7 @@
         <w:rPr>
           <w:lang w:val="en-US"/>
         </w:rPr>
+        <w:lastRenderedPageBreak/>
         <w:t>Architectural Requirements</w:t>
       </w:r>
     </w:p>
@@ -643,27 +608,7 @@
           <w:szCs w:val="28"/>
           <w:lang w:val="en-US"/>
         </w:rPr>
-        <w:t xml:space="preserve">Quality requirements determine the overall quality of </w:t>
-      </w:r>
-      <w:proofErr w:type="spellStart"/>
-      <w:r>
-        <w:rPr>
-          <w:rFonts w:ascii="Arial" w:hAnsi="Arial" w:cs="Arial"/>
-          <w:sz w:val="28"/>
-          <w:szCs w:val="28"/>
-          <w:lang w:val="en-US"/>
-        </w:rPr>
-        <w:t>TaxiTap</w:t>
-      </w:r>
-      <w:proofErr w:type="spellEnd"/>
-      <w:r>
-        <w:rPr>
-          <w:rFonts w:ascii="Arial" w:hAnsi="Arial" w:cs="Arial"/>
-          <w:sz w:val="28"/>
-          <w:szCs w:val="28"/>
-          <w:lang w:val="en-US"/>
-        </w:rPr>
-        <w:t xml:space="preserve"> by specifying criteria that define how well the system performs and behaves.</w:t>
+        <w:t>Quality requirements determine the overall quality of TaxiTap by specifying criteria that define how well the system performs and behaves.</w:t>
       </w:r>
     </w:p>
     <w:p>
@@ -964,27 +909,7 @@
           <w:szCs w:val="28"/>
           <w:lang w:val="en-US"/>
         </w:rPr>
-        <w:t xml:space="preserve">Constraints </w:t>
-      </w:r>
-      <w:proofErr w:type="gramStart"/>
-      <w:r>
-        <w:rPr>
-          <w:rFonts w:ascii="Arial" w:hAnsi="Arial" w:cs="Arial"/>
-          <w:sz w:val="28"/>
-          <w:szCs w:val="28"/>
-          <w:lang w:val="en-US"/>
-        </w:rPr>
-        <w:t>client</w:t>
-      </w:r>
-      <w:proofErr w:type="gramEnd"/>
-      <w:r>
-        <w:rPr>
-          <w:rFonts w:ascii="Arial" w:hAnsi="Arial" w:cs="Arial"/>
-          <w:sz w:val="28"/>
-          <w:szCs w:val="28"/>
-          <w:lang w:val="en-US"/>
-        </w:rPr>
-        <w:t xml:space="preserve"> laid out.</w:t>
+        <w:t>Constraints client laid out.</w:t>
       </w:r>
     </w:p>
     <w:sectPr>
@@ -1089,6 +1014,119 @@
     </w:lvl>
   </w:abstractNum>
   <w:abstractNum w:abstractNumId="1" w15:restartNumberingAfterBreak="0">
+    <w:nsid w:val="0E8361EF"/>
+    <w:multiLevelType w:val="multilevel"/>
+    <w:tmpl w:val="BCE4FDEE"/>
+    <w:lvl w:ilvl="0">
+      <w:start w:val="1"/>
+      <w:numFmt w:val="decimal"/>
+      <w:lvlText w:val="%1."/>
+      <w:lvlJc w:val="left"/>
+      <w:pPr>
+        <w:tabs>
+          <w:tab w:val="num" w:pos="720"/>
+        </w:tabs>
+        <w:ind w:left="720" w:hanging="360"/>
+      </w:pPr>
+    </w:lvl>
+    <w:lvl w:ilvl="1" w:tentative="1">
+      <w:start w:val="1"/>
+      <w:numFmt w:val="decimal"/>
+      <w:lvlText w:val="%2."/>
+      <w:lvlJc w:val="left"/>
+      <w:pPr>
+        <w:tabs>
+          <w:tab w:val="num" w:pos="1440"/>
+        </w:tabs>
+        <w:ind w:left="1440" w:hanging="360"/>
+      </w:pPr>
+    </w:lvl>
+    <w:lvl w:ilvl="2" w:tentative="1">
+      <w:start w:val="1"/>
+      <w:numFmt w:val="decimal"/>
+      <w:lvlText w:val="%3."/>
+      <w:lvlJc w:val="left"/>
+      <w:pPr>
+        <w:tabs>
+          <w:tab w:val="num" w:pos="2160"/>
+        </w:tabs>
+        <w:ind w:left="2160" w:hanging="360"/>
+      </w:pPr>
+    </w:lvl>
+    <w:lvl w:ilvl="3" w:tentative="1">
+      <w:start w:val="1"/>
+      <w:numFmt w:val="decimal"/>
+      <w:lvlText w:val="%4."/>
+      <w:lvlJc w:val="left"/>
+      <w:pPr>
+        <w:tabs>
+          <w:tab w:val="num" w:pos="2880"/>
+        </w:tabs>
+        <w:ind w:left="2880" w:hanging="360"/>
+      </w:pPr>
+    </w:lvl>
+    <w:lvl w:ilvl="4" w:tentative="1">
+      <w:start w:val="1"/>
+      <w:numFmt w:val="decimal"/>
+      <w:lvlText w:val="%5."/>
+      <w:lvlJc w:val="left"/>
+      <w:pPr>
+        <w:tabs>
+          <w:tab w:val="num" w:pos="3600"/>
+        </w:tabs>
+        <w:ind w:left="3600" w:hanging="360"/>
+      </w:pPr>
+    </w:lvl>
+    <w:lvl w:ilvl="5" w:tentative="1">
+      <w:start w:val="1"/>
+      <w:numFmt w:val="decimal"/>
+      <w:lvlText w:val="%6."/>
+      <w:lvlJc w:val="left"/>
+      <w:pPr>
+        <w:tabs>
+          <w:tab w:val="num" w:pos="4320"/>
+        </w:tabs>
+        <w:ind w:left="4320" w:hanging="360"/>
+      </w:pPr>
+    </w:lvl>
+    <w:lvl w:ilvl="6" w:tentative="1">
+      <w:start w:val="1"/>
+      <w:numFmt w:val="decimal"/>
+      <w:lvlText w:val="%7."/>
+      <w:lvlJc w:val="left"/>
+      <w:pPr>
+        <w:tabs>
+          <w:tab w:val="num" w:pos="5040"/>
+        </w:tabs>
+        <w:ind w:left="5040" w:hanging="360"/>
+      </w:pPr>
+    </w:lvl>
+    <w:lvl w:ilvl="7" w:tentative="1">
+      <w:start w:val="1"/>
+      <w:numFmt w:val="decimal"/>
+      <w:lvlText w:val="%8."/>
+      <w:lvlJc w:val="left"/>
+      <w:pPr>
+        <w:tabs>
+          <w:tab w:val="num" w:pos="5760"/>
+        </w:tabs>
+        <w:ind w:left="5760" w:hanging="360"/>
+      </w:pPr>
+    </w:lvl>
+    <w:lvl w:ilvl="8" w:tentative="1">
+      <w:start w:val="1"/>
+      <w:numFmt w:val="decimal"/>
+      <w:lvlText w:val="%9."/>
+      <w:lvlJc w:val="left"/>
+      <w:pPr>
+        <w:tabs>
+          <w:tab w:val="num" w:pos="6480"/>
+        </w:tabs>
+        <w:ind w:left="6480" w:hanging="360"/>
+      </w:pPr>
+    </w:lvl>
+  </w:abstractNum>
+  <w:abstractNum w:abstractNumId="2" w15:restartNumberingAfterBreak="0">
     <w:nsid w:val="174039FC"/>
     <w:multiLevelType w:val="hybridMultilevel"/>
     <w:tmpl w:val="C56670BE"/>
@@ -1178,10 +1216,13 @@
     </w:lvl>
   </w:abstractNum>
   <w:num w:numId="1" w16cid:durableId="1675918359">
-    <w:abstractNumId w:val="1"/>
+    <w:abstractNumId w:val="2"/>
   </w:num>
   <w:num w:numId="2" w16cid:durableId="2133210916">
     <w:abstractNumId w:val="0"/>
+  </w:num>
+  <w:num w:numId="3" w16cid:durableId="663699958">
+    <w:abstractNumId w:val="1"/>
   </w:num>
 </w:numbering>
 </file>

</xml_diff>

<commit_message>
Adding Passenger Interface functional requirements
</commit_message>
<xml_diff>
--- a/docs/SRS.docx
+++ b/docs/SRS.docx
@@ -25,11 +25,19 @@
           <w:lang w:val="en-US"/>
         </w:rPr>
       </w:pPr>
-      <w:r>
-        <w:rPr>
-          <w:lang w:val="en-US"/>
-        </w:rPr>
-        <w:t>TaxiTap by Git It Done</w:t>
+      <w:proofErr w:type="spellStart"/>
+      <w:r>
+        <w:rPr>
+          <w:lang w:val="en-US"/>
+        </w:rPr>
+        <w:t>TaxiTap</w:t>
+      </w:r>
+      <w:proofErr w:type="spellEnd"/>
+      <w:r>
+        <w:rPr>
+          <w:lang w:val="en-US"/>
+        </w:rPr>
+        <w:t xml:space="preserve"> by Git It Done</w:t>
       </w:r>
     </w:p>
     <w:p>
@@ -55,14 +63,25 @@
           <w:lang w:val="en-US"/>
         </w:rPr>
       </w:pPr>
-      <w:r>
-        <w:rPr>
-          <w:rFonts w:ascii="Arial" w:hAnsi="Arial" w:cs="Arial"/>
-          <w:sz w:val="28"/>
-          <w:szCs w:val="28"/>
-          <w:lang w:val="en-US"/>
-        </w:rPr>
-        <w:t>TaxiTap is a mobile platform designed to revolutionize South Africa’s minibus taxi industry by digitizing route information, eliminating the need for constant hooting, and creating a semi-structured booking system while preserving the flexibility that makes taxis an essential mode of transport. The system connects passengers and taxi operators through a location-aware mobile application that facilitates taxi requests, communicates passenger locations, manages payments, and provides real-time vehicle tracking – all without fundamentally changing the existing system's multi-passenger, flexible route nature.</w:t>
+      <w:proofErr w:type="spellStart"/>
+      <w:r>
+        <w:rPr>
+          <w:rFonts w:ascii="Arial" w:hAnsi="Arial" w:cs="Arial"/>
+          <w:sz w:val="28"/>
+          <w:szCs w:val="28"/>
+          <w:lang w:val="en-US"/>
+        </w:rPr>
+        <w:t>TaxiTap</w:t>
+      </w:r>
+      <w:proofErr w:type="spellEnd"/>
+      <w:r>
+        <w:rPr>
+          <w:rFonts w:ascii="Arial" w:hAnsi="Arial" w:cs="Arial"/>
+          <w:sz w:val="28"/>
+          <w:szCs w:val="28"/>
+          <w:lang w:val="en-US"/>
+        </w:rPr>
+        <w:t xml:space="preserve"> is a mobile platform designed to revolutionize South Africa’s minibus taxi industry by digitizing route information, eliminating the need for constant hooting, and creating a semi-structured booking system while preserving the flexibility that makes taxis an essential mode of transport. The system connects passengers and taxi operators through a location-aware mobile application that facilitates taxi requests, communicates passenger locations, manages payments, and provides real-time vehicle tracking – all without fundamentally changing the existing system's multi-passenger, flexible route nature.</w:t>
       </w:r>
     </w:p>
     <w:p>
@@ -318,7 +337,25 @@
           <w:sz w:val="28"/>
           <w:szCs w:val="28"/>
         </w:rPr>
-        <w:t>1.3 Users should be able to Login in to the system using a unique username and a password.</w:t>
+        <w:t xml:space="preserve">1.3 Users should be able to Login </w:t>
+      </w:r>
+      <w:proofErr w:type="gramStart"/>
+      <w:r>
+        <w:rPr>
+          <w:rFonts w:ascii="Arial" w:hAnsi="Arial" w:cs="Arial"/>
+          <w:sz w:val="28"/>
+          <w:szCs w:val="28"/>
+        </w:rPr>
+        <w:t>in to</w:t>
+      </w:r>
+      <w:proofErr w:type="gramEnd"/>
+      <w:r>
+        <w:rPr>
+          <w:rFonts w:ascii="Arial" w:hAnsi="Arial" w:cs="Arial"/>
+          <w:sz w:val="28"/>
+          <w:szCs w:val="28"/>
+        </w:rPr>
+        <w:t xml:space="preserve"> the system using a unique username and a password.</w:t>
       </w:r>
     </w:p>
     <w:p>
@@ -340,6 +377,123 @@
     </w:p>
     <w:p>
       <w:pPr>
+        <w:pStyle w:val="ListParagraph"/>
+        <w:numPr>
+          <w:ilvl w:val="0"/>
+          <w:numId w:val="3"/>
+        </w:numPr>
+        <w:rPr>
+          <w:rFonts w:ascii="Arial" w:hAnsi="Arial" w:cs="Arial"/>
+          <w:sz w:val="28"/>
+          <w:szCs w:val="28"/>
+        </w:rPr>
+      </w:pPr>
+      <w:r>
+        <w:rPr>
+          <w:rFonts w:ascii="Arial" w:hAnsi="Arial" w:cs="Arial"/>
+          <w:sz w:val="28"/>
+          <w:szCs w:val="28"/>
+        </w:rPr>
+        <w:t>Passenger System/Interface  </w:t>
+      </w:r>
+    </w:p>
+    <w:p>
+      <w:pPr>
+        <w:rPr>
+          <w:rFonts w:ascii="Arial" w:hAnsi="Arial" w:cs="Arial"/>
+          <w:sz w:val="28"/>
+          <w:szCs w:val="28"/>
+        </w:rPr>
+      </w:pPr>
+      <w:r>
+        <w:rPr>
+          <w:rFonts w:ascii="Arial" w:hAnsi="Arial" w:cs="Arial"/>
+          <w:sz w:val="28"/>
+          <w:szCs w:val="28"/>
+        </w:rPr>
+        <w:t>2.1 Passengers should be able to view nearby taxis.</w:t>
+      </w:r>
+    </w:p>
+    <w:p>
+      <w:pPr>
+        <w:rPr>
+          <w:rFonts w:ascii="Arial" w:hAnsi="Arial" w:cs="Arial"/>
+          <w:sz w:val="28"/>
+          <w:szCs w:val="28"/>
+        </w:rPr>
+      </w:pPr>
+      <w:r>
+        <w:rPr>
+          <w:rFonts w:ascii="Arial" w:hAnsi="Arial" w:cs="Arial"/>
+          <w:sz w:val="28"/>
+          <w:szCs w:val="28"/>
+        </w:rPr>
+        <w:t>2.2 Passengers should be able to receive a notification</w:t>
+      </w:r>
+    </w:p>
+    <w:p>
+      <w:pPr>
+        <w:rPr>
+          <w:rFonts w:ascii="Arial" w:hAnsi="Arial" w:cs="Arial"/>
+          <w:sz w:val="28"/>
+          <w:szCs w:val="28"/>
+        </w:rPr>
+      </w:pPr>
+      <w:r>
+        <w:rPr>
+          <w:rFonts w:ascii="Arial" w:hAnsi="Arial" w:cs="Arial"/>
+          <w:sz w:val="28"/>
+          <w:szCs w:val="28"/>
+        </w:rPr>
+        <w:t xml:space="preserve">2.3 Passengers should be able to request a </w:t>
+      </w:r>
+      <w:proofErr w:type="gramStart"/>
+      <w:r>
+        <w:rPr>
+          <w:rFonts w:ascii="Arial" w:hAnsi="Arial" w:cs="Arial"/>
+          <w:sz w:val="28"/>
+          <w:szCs w:val="28"/>
+        </w:rPr>
+        <w:t>pick up</w:t>
+      </w:r>
+      <w:proofErr w:type="gramEnd"/>
+      <w:r>
+        <w:rPr>
+          <w:rFonts w:ascii="Arial" w:hAnsi="Arial" w:cs="Arial"/>
+          <w:sz w:val="28"/>
+          <w:szCs w:val="28"/>
+        </w:rPr>
+        <w:t xml:space="preserve"> from an approximate location.</w:t>
+      </w:r>
+    </w:p>
+    <w:p>
+      <w:pPr>
+        <w:rPr>
+          <w:rFonts w:ascii="Arial" w:hAnsi="Arial" w:cs="Arial"/>
+          <w:sz w:val="28"/>
+          <w:szCs w:val="28"/>
+        </w:rPr>
+      </w:pPr>
+      <w:r>
+        <w:rPr>
+          <w:rFonts w:ascii="Arial" w:hAnsi="Arial" w:cs="Arial"/>
+          <w:sz w:val="28"/>
+          <w:szCs w:val="28"/>
+        </w:rPr>
+        <w:t>2.4 Passengers should be able request</w:t>
+      </w:r>
+    </w:p>
+    <w:p>
+      <w:pPr>
+        <w:rPr>
+          <w:rFonts w:ascii="Arial" w:hAnsi="Arial" w:cs="Arial"/>
+          <w:sz w:val="28"/>
+          <w:szCs w:val="28"/>
+        </w:rPr>
+      </w:pPr>
+    </w:p>
+    <w:p>
+      <w:pPr>
         <w:rPr>
           <w:rFonts w:ascii="Arial" w:hAnsi="Arial" w:cs="Arial"/>
           <w:sz w:val="28"/>
@@ -378,7 +532,27 @@
           <w:szCs w:val="28"/>
           <w:lang w:val="en-US"/>
         </w:rPr>
-        <w:t>Use case diagrams of different parts of system.</w:t>
+        <w:t xml:space="preserve">Use case diagrams of different parts of </w:t>
+      </w:r>
+      <w:proofErr w:type="gramStart"/>
+      <w:r>
+        <w:rPr>
+          <w:rFonts w:ascii="Arial" w:hAnsi="Arial" w:cs="Arial"/>
+          <w:sz w:val="28"/>
+          <w:szCs w:val="28"/>
+          <w:lang w:val="en-US"/>
+        </w:rPr>
+        <w:t>system</w:t>
+      </w:r>
+      <w:proofErr w:type="gramEnd"/>
+      <w:r>
+        <w:rPr>
+          <w:rFonts w:ascii="Arial" w:hAnsi="Arial" w:cs="Arial"/>
+          <w:sz w:val="28"/>
+          <w:szCs w:val="28"/>
+          <w:lang w:val="en-US"/>
+        </w:rPr>
+        <w:t>.</w:t>
       </w:r>
     </w:p>
     <w:p>
@@ -526,6 +700,7 @@
         <w:rPr>
           <w:lang w:val="en-US"/>
         </w:rPr>
+        <w:lastRenderedPageBreak/>
         <w:t>Version Control</w:t>
       </w:r>
     </w:p>
@@ -574,7 +749,6 @@
         <w:rPr>
           <w:lang w:val="en-US"/>
         </w:rPr>
-        <w:lastRenderedPageBreak/>
         <w:t>Architectural Requirements</w:t>
       </w:r>
     </w:p>
@@ -608,7 +782,27 @@
           <w:szCs w:val="28"/>
           <w:lang w:val="en-US"/>
         </w:rPr>
-        <w:t>Quality requirements determine the overall quality of TaxiTap by specifying criteria that define how well the system performs and behaves.</w:t>
+        <w:t xml:space="preserve">Quality requirements determine the overall quality of </w:t>
+      </w:r>
+      <w:proofErr w:type="spellStart"/>
+      <w:r>
+        <w:rPr>
+          <w:rFonts w:ascii="Arial" w:hAnsi="Arial" w:cs="Arial"/>
+          <w:sz w:val="28"/>
+          <w:szCs w:val="28"/>
+          <w:lang w:val="en-US"/>
+        </w:rPr>
+        <w:t>TaxiTap</w:t>
+      </w:r>
+      <w:proofErr w:type="spellEnd"/>
+      <w:r>
+        <w:rPr>
+          <w:rFonts w:ascii="Arial" w:hAnsi="Arial" w:cs="Arial"/>
+          <w:sz w:val="28"/>
+          <w:szCs w:val="28"/>
+          <w:lang w:val="en-US"/>
+        </w:rPr>
+        <w:t xml:space="preserve"> by specifying criteria that define how well the system performs and behaves.</w:t>
       </w:r>
     </w:p>
     <w:p>
@@ -909,7 +1103,27 @@
           <w:szCs w:val="28"/>
           <w:lang w:val="en-US"/>
         </w:rPr>
-        <w:t>Constraints client laid out.</w:t>
+        <w:t xml:space="preserve">Constraints </w:t>
+      </w:r>
+      <w:proofErr w:type="gramStart"/>
+      <w:r>
+        <w:rPr>
+          <w:rFonts w:ascii="Arial" w:hAnsi="Arial" w:cs="Arial"/>
+          <w:sz w:val="28"/>
+          <w:szCs w:val="28"/>
+          <w:lang w:val="en-US"/>
+        </w:rPr>
+        <w:t>client</w:t>
+      </w:r>
+      <w:proofErr w:type="gramEnd"/>
+      <w:r>
+        <w:rPr>
+          <w:rFonts w:ascii="Arial" w:hAnsi="Arial" w:cs="Arial"/>
+          <w:sz w:val="28"/>
+          <w:szCs w:val="28"/>
+          <w:lang w:val="en-US"/>
+        </w:rPr>
+        <w:t xml:space="preserve"> laid out.</w:t>
       </w:r>
     </w:p>
     <w:sectPr>
@@ -1215,6 +1429,119 @@
       </w:pPr>
     </w:lvl>
   </w:abstractNum>
+  <w:abstractNum w:abstractNumId="3" w15:restartNumberingAfterBreak="0">
+    <w:nsid w:val="3B752722"/>
+    <w:multiLevelType w:val="multilevel"/>
+    <w:tmpl w:val="D4CE5E54"/>
+    <w:lvl w:ilvl="0">
+      <w:start w:val="1"/>
+      <w:numFmt w:val="decimal"/>
+      <w:lvlText w:val="%1."/>
+      <w:lvlJc w:val="left"/>
+      <w:pPr>
+        <w:tabs>
+          <w:tab w:val="num" w:pos="720"/>
+        </w:tabs>
+        <w:ind w:left="720" w:hanging="360"/>
+      </w:pPr>
+    </w:lvl>
+    <w:lvl w:ilvl="1" w:tentative="1">
+      <w:start w:val="1"/>
+      <w:numFmt w:val="decimal"/>
+      <w:lvlText w:val="%2."/>
+      <w:lvlJc w:val="left"/>
+      <w:pPr>
+        <w:tabs>
+          <w:tab w:val="num" w:pos="1440"/>
+        </w:tabs>
+        <w:ind w:left="1440" w:hanging="360"/>
+      </w:pPr>
+    </w:lvl>
+    <w:lvl w:ilvl="2" w:tentative="1">
+      <w:start w:val="1"/>
+      <w:numFmt w:val="decimal"/>
+      <w:lvlText w:val="%3."/>
+      <w:lvlJc w:val="left"/>
+      <w:pPr>
+        <w:tabs>
+          <w:tab w:val="num" w:pos="2160"/>
+        </w:tabs>
+        <w:ind w:left="2160" w:hanging="360"/>
+      </w:pPr>
+    </w:lvl>
+    <w:lvl w:ilvl="3" w:tentative="1">
+      <w:start w:val="1"/>
+      <w:numFmt w:val="decimal"/>
+      <w:lvlText w:val="%4."/>
+      <w:lvlJc w:val="left"/>
+      <w:pPr>
+        <w:tabs>
+          <w:tab w:val="num" w:pos="2880"/>
+        </w:tabs>
+        <w:ind w:left="2880" w:hanging="360"/>
+      </w:pPr>
+    </w:lvl>
+    <w:lvl w:ilvl="4" w:tentative="1">
+      <w:start w:val="1"/>
+      <w:numFmt w:val="decimal"/>
+      <w:lvlText w:val="%5."/>
+      <w:lvlJc w:val="left"/>
+      <w:pPr>
+        <w:tabs>
+          <w:tab w:val="num" w:pos="3600"/>
+        </w:tabs>
+        <w:ind w:left="3600" w:hanging="360"/>
+      </w:pPr>
+    </w:lvl>
+    <w:lvl w:ilvl="5" w:tentative="1">
+      <w:start w:val="1"/>
+      <w:numFmt w:val="decimal"/>
+      <w:lvlText w:val="%6."/>
+      <w:lvlJc w:val="left"/>
+      <w:pPr>
+        <w:tabs>
+          <w:tab w:val="num" w:pos="4320"/>
+        </w:tabs>
+        <w:ind w:left="4320" w:hanging="360"/>
+      </w:pPr>
+    </w:lvl>
+    <w:lvl w:ilvl="6" w:tentative="1">
+      <w:start w:val="1"/>
+      <w:numFmt w:val="decimal"/>
+      <w:lvlText w:val="%7."/>
+      <w:lvlJc w:val="left"/>
+      <w:pPr>
+        <w:tabs>
+          <w:tab w:val="num" w:pos="5040"/>
+        </w:tabs>
+        <w:ind w:left="5040" w:hanging="360"/>
+      </w:pPr>
+    </w:lvl>
+    <w:lvl w:ilvl="7" w:tentative="1">
+      <w:start w:val="1"/>
+      <w:numFmt w:val="decimal"/>
+      <w:lvlText w:val="%8."/>
+      <w:lvlJc w:val="left"/>
+      <w:pPr>
+        <w:tabs>
+          <w:tab w:val="num" w:pos="5760"/>
+        </w:tabs>
+        <w:ind w:left="5760" w:hanging="360"/>
+      </w:pPr>
+    </w:lvl>
+    <w:lvl w:ilvl="8" w:tentative="1">
+      <w:start w:val="1"/>
+      <w:numFmt w:val="decimal"/>
+      <w:lvlText w:val="%9."/>
+      <w:lvlJc w:val="left"/>
+      <w:pPr>
+        <w:tabs>
+          <w:tab w:val="num" w:pos="6480"/>
+        </w:tabs>
+        <w:ind w:left="6480" w:hanging="360"/>
+      </w:pPr>
+    </w:lvl>
+  </w:abstractNum>
   <w:num w:numId="1" w16cid:durableId="1675918359">
     <w:abstractNumId w:val="2"/>
   </w:num>
@@ -1223,6 +1550,9 @@
   </w:num>
   <w:num w:numId="3" w16cid:durableId="663699958">
     <w:abstractNumId w:val="1"/>
+  </w:num>
+  <w:num w:numId="4" w16cid:durableId="720598500">
+    <w:abstractNumId w:val="3"/>
   </w:num>
 </w:numbering>
 </file>

</xml_diff>